<commit_message>
update AI Infra resumes and interview materials
</commit_message>
<xml_diff>
--- a/doc/Haoran_Feng_AIInfra_Resume.docx
+++ b/doc/Haoran_Feng_AIInfra_Resume.docx
@@ -530,11 +530,45 @@
           <w:p>
             <w:pPr>
               <w:keepLines w:val="0"/>
+              <w:spacing w:before="0" w:after="9" w:line="240" w:lineRule="auto"/>
+              <w:ind w:left="140" w:hanging="140"/>
+              <w:jc w:val="left"/>
+            </w:pPr>
+            <w:r/>
+            <w:r>
+              <w:rPr>
+                <w:rFonts w:ascii="Times New Roman" w:hAnsi="Times New Roman" w:eastAsia="宋体"/>
+                <w:b w:val="0"/>
+                <w:sz w:val="16"/>
+                <w:u w:val="none"/>
+              </w:rPr>
+              <w:t xml:space="preserve">• </w:t>
+            </w:r>
+            <w:r>
+              <w:rPr>
+                <w:rFonts w:ascii="Times New Roman" w:hAnsi="Times New Roman" w:eastAsia="宋体"/>
+                <w:b/>
+                <w:sz w:val="16"/>
+                <w:u w:val="none"/>
+              </w:rPr>
+              <w:t xml:space="preserve">300B-class MoE foundation model development and optimization: </w:t>
+            </w:r>
+            <w:r>
+              <w:rPr>
+                <w:rFonts w:ascii="Times New Roman" w:hAnsi="Times New Roman" w:eastAsia="宋体"/>
+                <w:b w:val="0"/>
+                <w:sz w:val="16"/>
+                <w:u w:val="none"/>
+              </w:rPr>
+              <w:t>Developing training, inference, and RL-rollout infrastructure for an internal 300B-class MoE foundation model, with ownership spanning kernel performance, runtime stability, and multi-GPU validation.</w:t>
+            </w:r>
+          </w:p>
+          <w:p>
+            <w:pPr>
+              <w:keepLines w:val="0"/>
               <w:spacing w:before="0" w:after="5" w:line="240" w:lineRule="auto"/>
               <w:ind w:left="140" w:hanging="140"/>
-              <w:jc w:val="left"/>
-            </w:pPr>
-            <w:r/>
+            </w:pPr>
             <w:r>
               <w:rPr>
                 <w:rFonts w:ascii="Times New Roman" w:hAnsi="Times New Roman" w:eastAsia="宋体"/>
@@ -771,7 +805,7 @@
                 <w:sz w:val="16"/>
                 <w:u w:val="none"/>
               </w:rPr>
-              <w:t>Built token/layer/top-k route capture, transport, training-side replay, response-mask alignment, and mismatch/f-tau2/KL diagnostics between vLLM and Megatron. On 8xH200/Qwen3-30B-A3B, reduced route mismatch from 17-19% to 0, f-tau2 by 36-145x, and KL by 4-7x; extended to a monitored 128-GPU, 200-step rollout with aligned key metrics.</w:t>
+              <w:t>Built token/layer/top-k route capture, transport, training-side replay, response-mask alignment, and mismatch/f-tau2/KL diagnostics between vLLM and Megatron. On 8xH200/Qwen3-30B-A3B, reduced route mismatch from 17-19% to 0, f-tau2 by 36-145x, and KL by 4-7x; extended to a monitored 128-GPU, 200-step rollout on an internal 300B-class MoE foundation model with aligned key metrics.</w:t>
             </w:r>
           </w:p>
           <w:p>
@@ -1306,7 +1340,7 @@
           <w:p>
             <w:pPr>
               <w:keepLines w:val="0"/>
-              <w:spacing w:before="0" w:after="2" w:line="240" w:lineRule="auto"/>
+              <w:spacing w:before="0" w:after="4" w:line="240" w:lineRule="auto"/>
               <w:ind w:left="140" w:hanging="140"/>
               <w:jc w:val="left"/>
             </w:pPr>
@@ -1327,7 +1361,7 @@
                 <w:sz w:val="16"/>
                 <w:u w:val="none"/>
               </w:rPr>
-              <w:t xml:space="preserve">Quantized runtime, kernel debugging, and TP2 deployment: </w:t>
+              <w:t xml:space="preserve">H200 quantized-runtime deployment and TP2 extension: </w:t>
             </w:r>
             <w:r>
               <w:rPr>
@@ -1336,7 +1370,7 @@
                 <w:sz w:val="16"/>
                 <w:u w:val="none"/>
               </w:rPr>
-              <w:t>Added configurable FlashAttention-2/4, GQA KV-head expansion, soft-cap masking, SDPA fallback, and multi-GPU builds to a W4A16/W8A8/FP8 runtime. Used Compute Sanitizer to fix a tail-group out-of-bounds access and implemented packed-AWQ TP=2 sharding with NCCL all-reduce. All four Sanitizer modes passed representative shapes; two-GPU Qwen2.5-Coder-32B W4A16 reduced checkpoint/peak memory by 70.5%/66.8% and increased end-to-end output throughput by 76.8%.</w:t>
+              <w:t>To deliver 32B quantized inference on two H200 GPUs, owned W4A16/W8A8/FP8 backend adaptation, FlashAttention-2/4 and GQA/soft-cap/SDPA integration, and kernel debugging. Used Compute Sanitizer to fix a tail-group out-of-bounds access, then implemented packed-AWQ TP=2 sharding with NCCL all-reduce. All four Sanitizer modes passed representative shapes; two-GPU Qwen2.5-Coder-32B W4A16 reduced checkpoint/peak memory by 70.5%/66.8% and increased end-to-end output throughput by 76.8%.</w:t>
             </w:r>
           </w:p>
         </w:tc>
@@ -1484,7 +1518,7 @@
                 <w:sz w:val="16"/>
                 <w:u w:val="none"/>
               </w:rPr>
-              <w:t xml:space="preserve">Method and results: </w:t>
+              <w:t xml:space="preserve">Token-weighted CoT distillation: </w:t>
             </w:r>
             <w:r>
               <w:rPr>
@@ -1493,7 +1527,7 @@
                 <w:sz w:val="16"/>
                 <w:u w:val="none"/>
               </w:rPr>
-              <w:t>Trained and tuned a three-stage structure-recovery, token-weighted supervision, and preference-optimization pipeline; token importance was estimated from reference-answer likelihood drops after teacher-rationale perturbations. Completed LoRA/DPO training and vLLM TP=4 evaluation. Qwen2.5-7B-Instruct reached 94.01%/94.00% on GSM8K/SVAMP, +5.51/+10.10 points over the strongest baselines; manuscript submitted to AAAI 2027.</w:t>
+              <w:t>To address the lack of token-level importance awareness in generic CoT distillation, contributed to a three-stage structure-recovery, token-weighted supervision, and preference-optimization pipeline. Owned training, hyperparameter tuning, and vLLM TP=4 evaluation; estimated importance from reference-answer likelihood drops after teacher-rationale perturbations and applied it to weighted SFT plus an auxiliary loss. Qwen2.5-7B-Instruct reached 94.01%/94.00% on GSM8K/SVAMP, +5.51/+10.10 points over the strongest baselines; manuscript submitted to AAAI 2027.</w:t>
             </w:r>
           </w:p>
         </w:tc>

</xml_diff>

<commit_message>
add linked training and inference resume variants
</commit_message>
<xml_diff>
--- a/doc/Haoran_Feng_AIInfra_Resume.docx
+++ b/doc/Haoran_Feng_AIInfra_Resume.docx
@@ -79,8 +79,20 @@
                 <w:sz w:val="20"/>
                 <w:u w:val="none"/>
               </w:rPr>
-              <w:t>Phone: (+86) 150 2499 9885    Email: 225010160@link.cuhk.edu.cn    Portfolio</w:t>
-            </w:r>
+              <w:t xml:space="preserve">Phone: (+86) 150 2499 9885    Email: 225010160@link.cuhk.edu.cn    Website: </w:t>
+            </w:r>
+            <w:hyperlink r:id="rId8">
+              <w:r>
+                <w:rPr>
+                  <w:rFonts w:ascii="Times New Roman" w:hAnsi="Times New Roman" w:eastAsia="宋体"/>
+                  <w:b w:val="0"/>
+                  <w:color w:val="0563C1"/>
+                  <w:sz w:val="20"/>
+                  <w:u w:val="single"/>
+                </w:rPr>
+                <w:t>xfdg.github.io</w:t>
+              </w:r>
+            </w:hyperlink>
           </w:p>
         </w:tc>
       </w:tr>
@@ -1460,20 +1472,8 @@
                 <w:sz w:val="17"/>
                 <w:u w:val="none"/>
               </w:rPr>
-              <w:t xml:space="preserve">Token-Weighted CoT Distillation | AAAI 2027 Submission | </w:t>
-            </w:r>
-            <w:hyperlink r:id="rId17">
-              <w:r>
-                <w:rPr>
-                  <w:rFonts w:ascii="Times New Roman" w:hAnsi="Times New Roman" w:eastAsia="宋体"/>
-                  <w:b w:val="0"/>
-                  <w:color w:val="0563C1"/>
-                  <w:sz w:val="17"/>
-                  <w:u w:val="single"/>
-                </w:rPr>
-                <w:t>Code</w:t>
-              </w:r>
-            </w:hyperlink>
+              <w:t>Token-Weighted CoT Distillation | AAAI 2027 Submission</w:t>
+            </w:r>
           </w:p>
         </w:tc>
       </w:tr>

</xml_diff>